<commit_message>
fix(ml48): ml48 naming and port the audited ml47 retraining
- Rename m48_dnsl_fallas_maquinaria_pasteurizado -> ml48_dairy_dnsl_critical_point_detection
  (plugin, registry, conftest, tests); MLflow contract as in Bitbucket (422/502, no base fallback)
- /train: ml47's port of the original trainer.py + fine_tuner.py (mode fine_tune|full, original
  noise stream, digital twin follows APPLY_DIGITAL_TWIN, own SHAP background per retrained model)
- Re-verified against refreshed inbox/a48/codigo: golden 20/20, cycle 123 XAI, SHAP background,
  split == cycle_splits.json; real fine_tune 0.9970 / full 0.9849 exact match
- a48 manifest, verification report, datos_a48.json and fichas updated
</commit_message>
<xml_diff>
--- a/outputs/a48/a48_ficha_tecnica.docx
+++ b/outputs/a48/a48_ficha_tecnica.docx
@@ -466,7 +466,7 @@
           </w:tcPr>
           <w:p ns2:paraId="4D4993D6" ns2:textId="77777777">
             <w:r>
-              <w:t xml:space="preserve">m48-dnsl-fallas-maquinaria-pasteurizado</w:t>
+              <w:t xml:space="preserve">ml48-dairy-dnsl-critical-point-detection</w:t>
             </w:r>
           </w:p>
         </w:tc>
@@ -4473,7 +4473,7 @@
           </w:tcPr>
           <w:p ns2:paraId="43E2B30F" ns2:textId="77777777">
             <w:r>
-              <w:t xml:space="preserve">20 ciclos de test (semilla 42, cubren las 12 parejas componente/clase); etiqueta real de profile.txt; plugin m48 con apply_digital_twin=true</w:t>
+              <w:t xml:space="preserve">20 ciclos de test (semilla 42, cubren las 12 parejas componente/clase); etiqueta real de profile.txt; plugin ml48 con apply_digital_twin=true</w:t>
             </w:r>
           </w:p>
         </w:tc>
@@ -4997,7 +4997,7 @@
           </w:tcPr>
           <w:p ns2:paraId="3E7B7A63" ns2:textId="77777777">
             <w:r>
-              <w:t xml:space="preserve">Reentrenamiento completo (300 épocas) y /train contra un MLflow real no verificados; el plugin reentrena con los hiperparámetros del equipo, pero sus métricas a escala completa no se han comprobado.</w:t>
+              <w:t xml:space="preserve">/train contra un MLflow real no verificado. El reentrenamiento sí está verificado con los datos entregados (14/10/2026): calibración fine_tune (por defecto) 0,9970 de exact match en el 15 % de test; reentrenamiento full desde cero 0,9849 de exact match en GPU (94 épocas), frente al 0,9879 del modelo entregado: en GPU el entrenamiento no es bit a bit reproducible y varía ±1 ciclo de test entre ejecuciones.</w:t>
             </w:r>
           </w:p>
         </w:tc>
@@ -5041,7 +5041,7 @@
         <w:jc w:val="both"/>
       </w:pPr>
       <w:r>
-        <w:t xml:space="preserve">Python 3.12; PyTorch ≥ 2.13 (CPU suficiente, sin GPU), scikit-learn 1.5.2 (el scaler se regeneró con esta versión), shap ≥ 0,51 (verificado 0,52.0), pandas / numpy. Artefactos ≈ 4 MB (pesos 592 KB + fondo SHAP 3,4 MB) en s3://xai/artifacts/fixed/a48_dnsl_fallas_maquinaria_pasteurizado/. Grad-CAM &lt; 0,1 s por ciclo (20 ciclos con XAI en &lt; 1 s); SHAP ≈ 5–8 s por ciclo, opcional y limitado por n_samples en batch. El plugin se despliega con MODEL=m48-dnsl-fallas-maquinaria-pasteurizado y sirve modelo-47; monitorizar deriva con el detector ODD (modelo-47) y revisar umbrales y acciones al disponer de datos reales.</w:t>
+        <w:t xml:space="preserve">Python 3.12; PyTorch ≥ 2.13 (CPU suficiente, sin GPU), scikit-learn 1.5.2 (el scaler se regeneró con esta versión), shap ≥ 0,51 (verificado 0,52.0), pandas / numpy. Artefactos ≈ 4 MB (pesos 592 KB + fondo SHAP 3,4 MB) en s3://xai/artifacts/fixed/ml48_dairy_dnsl_critical_point_detection/. Grad-CAM &lt; 0,1 s por ciclo (20 ciclos con XAI en &lt; 1 s); SHAP ≈ 5–8 s por ciclo, opcional y limitado por n_samples en batch. El plugin se despliega con MODEL=ml48-dairy-dnsl-critical-point-detection y sirve modelo-47; monitorizar deriva con el detector ODD (modelo-47) y revisar umbrales y acciones al disponer de datos reales.</w:t>
       </w:r>
     </w:p>
     <w:p ns2:paraId="642BAC39" ns2:textId="77777777"/>

</xml_diff>